<commit_message>
feat: implementar base SaaS multi-tenant con auth, roles y manejo de errores
</commit_message>
<xml_diff>
--- a/DOCUMENTACIÓN/SEMANA3_FASE1.docx
+++ b/DOCUMENTACIÓN/SEMANA3_FASE1.docx
@@ -56,8 +56,10 @@
         <w:rPr>
           <w:rFonts w:ascii="Times New Roman" w:hAnsi="Times New Roman" w:cs="Times New Roman"/>
           <w:b/>
-          <w:sz w:val="24"/>
-          <w:szCs w:val="24"/>
+          <w:noProof/>
+          <w:sz w:val="24"/>
+          <w:szCs w:val="24"/>
+          <w:lang w:eastAsia="es-EC"/>
         </w:rPr>
         <w:drawing>
           <wp:inline distT="0" distB="0" distL="0" distR="0" wp14:anchorId="484D0DF8" wp14:editId="273D6321">
@@ -190,8 +192,10 @@
         <w:rPr>
           <w:rFonts w:ascii="Times New Roman" w:hAnsi="Times New Roman" w:cs="Times New Roman"/>
           <w:b/>
-          <w:sz w:val="24"/>
-          <w:szCs w:val="24"/>
+          <w:noProof/>
+          <w:sz w:val="24"/>
+          <w:szCs w:val="24"/>
+          <w:lang w:eastAsia="es-EC"/>
         </w:rPr>
         <w:drawing>
           <wp:inline distT="0" distB="0" distL="0" distR="0" wp14:anchorId="61CF527F" wp14:editId="74CFF66E">
@@ -465,8 +469,10 @@
         <w:rPr>
           <w:rFonts w:ascii="Times New Roman" w:hAnsi="Times New Roman" w:cs="Times New Roman"/>
           <w:b/>
-          <w:sz w:val="24"/>
-          <w:szCs w:val="24"/>
+          <w:noProof/>
+          <w:sz w:val="24"/>
+          <w:szCs w:val="24"/>
+          <w:lang w:eastAsia="es-EC"/>
         </w:rPr>
         <w:lastRenderedPageBreak/>
         <w:drawing>
@@ -607,77 +613,6 @@
           <w:szCs w:val="24"/>
         </w:rPr>
       </w:pPr>
-      <w:proofErr w:type="spellStart"/>
-      <w:r>
-        <w:rPr>
-          <w:rFonts w:ascii="Times New Roman" w:hAnsi="Times New Roman" w:cs="Times New Roman"/>
-          <w:b/>
-          <w:sz w:val="24"/>
-          <w:szCs w:val="24"/>
-        </w:rPr>
-        <w:t>Login</w:t>
-      </w:r>
-      <w:proofErr w:type="spellEnd"/>
-      <w:r>
-        <w:rPr>
-          <w:rFonts w:ascii="Times New Roman" w:hAnsi="Times New Roman" w:cs="Times New Roman"/>
-          <w:b/>
-          <w:sz w:val="24"/>
-          <w:szCs w:val="24"/>
-        </w:rPr>
-        <w:t xml:space="preserve"> → /</w:t>
-      </w:r>
-      <w:proofErr w:type="spellStart"/>
-      <w:r>
-        <w:rPr>
-          <w:rFonts w:ascii="Times New Roman" w:hAnsi="Times New Roman" w:cs="Times New Roman"/>
-          <w:b/>
-          <w:sz w:val="24"/>
-          <w:szCs w:val="24"/>
-        </w:rPr>
-        <w:t>auth</w:t>
-      </w:r>
-      <w:proofErr w:type="spellEnd"/>
-      <w:r>
-        <w:rPr>
-          <w:rFonts w:ascii="Times New Roman" w:hAnsi="Times New Roman" w:cs="Times New Roman"/>
-          <w:b/>
-          <w:sz w:val="24"/>
-          <w:szCs w:val="24"/>
-        </w:rPr>
-        <w:t>/</w:t>
-      </w:r>
-      <w:proofErr w:type="spellStart"/>
-      <w:r>
-        <w:rPr>
-          <w:rFonts w:ascii="Times New Roman" w:hAnsi="Times New Roman" w:cs="Times New Roman"/>
-          <w:b/>
-          <w:sz w:val="24"/>
-          <w:szCs w:val="24"/>
-        </w:rPr>
-        <w:t>login</w:t>
-      </w:r>
-      <w:proofErr w:type="spellEnd"/>
-      <w:r>
-        <w:rPr>
-          <w:rFonts w:ascii="Times New Roman" w:hAnsi="Times New Roman" w:cs="Times New Roman"/>
-          <w:b/>
-          <w:sz w:val="24"/>
-          <w:szCs w:val="24"/>
-        </w:rPr>
-        <w:t xml:space="preserve"> </w:t>
-      </w:r>
-    </w:p>
-    <w:p>
-      <w:pPr>
-        <w:jc w:val="both"/>
-        <w:rPr>
-          <w:rFonts w:ascii="Times New Roman" w:hAnsi="Times New Roman" w:cs="Times New Roman"/>
-          <w:b/>
-          <w:sz w:val="24"/>
-          <w:szCs w:val="24"/>
-        </w:rPr>
-      </w:pPr>
       <w:r>
         <w:rPr>
           <w:rFonts w:ascii="Times New Roman" w:hAnsi="Times New Roman" w:cs="Times New Roman"/>
@@ -686,10 +621,10 @@
           <w:szCs w:val="24"/>
         </w:rPr>
         <w:drawing>
-          <wp:inline distT="0" distB="0" distL="0" distR="0" wp14:anchorId="0DB33C2F" wp14:editId="301895F1">
-            <wp:extent cx="5400040" cy="2542540"/>
+          <wp:inline distT="0" distB="0" distL="0" distR="0" wp14:anchorId="341226E0" wp14:editId="407C9E83">
+            <wp:extent cx="5400040" cy="2536825"/>
             <wp:effectExtent l="0" t="0" r="0" b="0"/>
-            <wp:docPr id="9" name="Imagen 9"/>
+            <wp:docPr id="10" name="Imagen 10"/>
             <wp:cNvGraphicFramePr>
               <a:graphicFrameLocks xmlns:a="http://schemas.openxmlformats.org/drawingml/2006/main" noChangeAspect="1"/>
             </wp:cNvGraphicFramePr>
@@ -709,7 +644,7 @@
                   <pic:spPr>
                     <a:xfrm>
                       <a:off x="0" y="0"/>
-                      <a:ext cx="5400040" cy="2542540"/>
+                      <a:ext cx="5400040" cy="2536825"/>
                     </a:xfrm>
                     <a:prstGeom prst="rect">
                       <a:avLst/>
@@ -721,8 +656,94 @@
           </wp:inline>
         </w:drawing>
       </w:r>
-      <w:bookmarkStart w:id="0" w:name="_GoBack"/>
-      <w:bookmarkEnd w:id="0"/>
+    </w:p>
+    <w:p>
+      <w:pPr>
+        <w:jc w:val="both"/>
+        <w:rPr>
+          <w:rFonts w:ascii="Times New Roman" w:hAnsi="Times New Roman" w:cs="Times New Roman"/>
+          <w:b/>
+          <w:sz w:val="24"/>
+          <w:szCs w:val="24"/>
+        </w:rPr>
+      </w:pPr>
+    </w:p>
+    <w:p>
+      <w:pPr>
+        <w:jc w:val="both"/>
+        <w:rPr>
+          <w:rFonts w:ascii="Times New Roman" w:hAnsi="Times New Roman" w:cs="Times New Roman"/>
+          <w:b/>
+          <w:sz w:val="24"/>
+          <w:szCs w:val="24"/>
+        </w:rPr>
+      </w:pPr>
+    </w:p>
+    <w:p>
+      <w:pPr>
+        <w:jc w:val="both"/>
+        <w:rPr>
+          <w:rFonts w:ascii="Times New Roman" w:hAnsi="Times New Roman" w:cs="Times New Roman"/>
+          <w:b/>
+          <w:sz w:val="24"/>
+          <w:szCs w:val="24"/>
+        </w:rPr>
+      </w:pPr>
+    </w:p>
+    <w:p>
+      <w:pPr>
+        <w:jc w:val="both"/>
+        <w:rPr>
+          <w:rFonts w:ascii="Times New Roman" w:hAnsi="Times New Roman" w:cs="Times New Roman"/>
+          <w:b/>
+          <w:sz w:val="24"/>
+          <w:szCs w:val="24"/>
+        </w:rPr>
+      </w:pPr>
+    </w:p>
+    <w:p>
+      <w:pPr>
+        <w:jc w:val="both"/>
+        <w:rPr>
+          <w:rFonts w:ascii="Times New Roman" w:hAnsi="Times New Roman" w:cs="Times New Roman"/>
+          <w:b/>
+          <w:sz w:val="24"/>
+          <w:szCs w:val="24"/>
+        </w:rPr>
+      </w:pPr>
+    </w:p>
+    <w:p>
+      <w:pPr>
+        <w:jc w:val="both"/>
+        <w:rPr>
+          <w:rFonts w:ascii="Times New Roman" w:hAnsi="Times New Roman" w:cs="Times New Roman"/>
+          <w:b/>
+          <w:sz w:val="24"/>
+          <w:szCs w:val="24"/>
+        </w:rPr>
+      </w:pPr>
+    </w:p>
+    <w:p>
+      <w:pPr>
+        <w:jc w:val="both"/>
+        <w:rPr>
+          <w:rFonts w:ascii="Times New Roman" w:hAnsi="Times New Roman" w:cs="Times New Roman"/>
+          <w:b/>
+          <w:sz w:val="24"/>
+          <w:szCs w:val="24"/>
+        </w:rPr>
+      </w:pPr>
+    </w:p>
+    <w:p>
+      <w:pPr>
+        <w:jc w:val="both"/>
+        <w:rPr>
+          <w:rFonts w:ascii="Times New Roman" w:hAnsi="Times New Roman" w:cs="Times New Roman"/>
+          <w:b/>
+          <w:sz w:val="24"/>
+          <w:szCs w:val="24"/>
+        </w:rPr>
+      </w:pPr>
     </w:p>
     <w:p>
       <w:pPr>
@@ -742,7 +763,8 @@
           <w:sz w:val="24"/>
           <w:szCs w:val="24"/>
         </w:rPr>
-        <w:t>Refresh</w:t>
+        <w:lastRenderedPageBreak/>
+        <w:t>Login</w:t>
       </w:r>
       <w:proofErr w:type="spellEnd"/>
       <w:r>
@@ -752,132 +774,73 @@
           <w:sz w:val="24"/>
           <w:szCs w:val="24"/>
         </w:rPr>
+        <w:t xml:space="preserve"> → /</w:t>
+      </w:r>
+      <w:proofErr w:type="spellStart"/>
+      <w:r>
+        <w:rPr>
+          <w:rFonts w:ascii="Times New Roman" w:hAnsi="Times New Roman" w:cs="Times New Roman"/>
+          <w:b/>
+          <w:sz w:val="24"/>
+          <w:szCs w:val="24"/>
+        </w:rPr>
+        <w:t>auth</w:t>
+      </w:r>
+      <w:proofErr w:type="spellEnd"/>
+      <w:r>
+        <w:rPr>
+          <w:rFonts w:ascii="Times New Roman" w:hAnsi="Times New Roman" w:cs="Times New Roman"/>
+          <w:b/>
+          <w:sz w:val="24"/>
+          <w:szCs w:val="24"/>
+        </w:rPr>
+        <w:t>/</w:t>
+      </w:r>
+      <w:proofErr w:type="spellStart"/>
+      <w:r>
+        <w:rPr>
+          <w:rFonts w:ascii="Times New Roman" w:hAnsi="Times New Roman" w:cs="Times New Roman"/>
+          <w:b/>
+          <w:sz w:val="24"/>
+          <w:szCs w:val="24"/>
+        </w:rPr>
+        <w:t>login</w:t>
+      </w:r>
+      <w:proofErr w:type="spellEnd"/>
+      <w:r>
+        <w:rPr>
+          <w:rFonts w:ascii="Times New Roman" w:hAnsi="Times New Roman" w:cs="Times New Roman"/>
+          <w:b/>
+          <w:sz w:val="24"/>
+          <w:szCs w:val="24"/>
+        </w:rPr>
         <w:t xml:space="preserve"> </w:t>
       </w:r>
-      <w:proofErr w:type="spellStart"/>
-      <w:r>
-        <w:rPr>
-          <w:rFonts w:ascii="Times New Roman" w:hAnsi="Times New Roman" w:cs="Times New Roman"/>
-          <w:b/>
-          <w:sz w:val="24"/>
-          <w:szCs w:val="24"/>
-        </w:rPr>
-        <w:t>token</w:t>
-      </w:r>
-      <w:proofErr w:type="spellEnd"/>
-      <w:r>
-        <w:rPr>
-          <w:rFonts w:ascii="Times New Roman" w:hAnsi="Times New Roman" w:cs="Times New Roman"/>
-          <w:b/>
-          <w:sz w:val="24"/>
-          <w:szCs w:val="24"/>
-        </w:rPr>
-        <w:t xml:space="preserve"> → /</w:t>
-      </w:r>
-      <w:proofErr w:type="spellStart"/>
-      <w:r>
-        <w:rPr>
-          <w:rFonts w:ascii="Times New Roman" w:hAnsi="Times New Roman" w:cs="Times New Roman"/>
-          <w:b/>
-          <w:sz w:val="24"/>
-          <w:szCs w:val="24"/>
-        </w:rPr>
-        <w:t>auth</w:t>
-      </w:r>
-      <w:proofErr w:type="spellEnd"/>
-      <w:r>
-        <w:rPr>
-          <w:rFonts w:ascii="Times New Roman" w:hAnsi="Times New Roman" w:cs="Times New Roman"/>
-          <w:b/>
-          <w:sz w:val="24"/>
-          <w:szCs w:val="24"/>
-        </w:rPr>
-        <w:t>/</w:t>
-      </w:r>
-      <w:proofErr w:type="spellStart"/>
-      <w:r>
-        <w:rPr>
-          <w:rFonts w:ascii="Times New Roman" w:hAnsi="Times New Roman" w:cs="Times New Roman"/>
-          <w:b/>
-          <w:sz w:val="24"/>
-          <w:szCs w:val="24"/>
-        </w:rPr>
-        <w:t>refresh</w:t>
-      </w:r>
-      <w:proofErr w:type="spellEnd"/>
-      <w:r>
-        <w:rPr>
-          <w:rFonts w:ascii="Times New Roman" w:hAnsi="Times New Roman" w:cs="Times New Roman"/>
-          <w:b/>
-          <w:sz w:val="24"/>
-          <w:szCs w:val="24"/>
-        </w:rPr>
-        <w:t xml:space="preserve"> </w:t>
-      </w:r>
-    </w:p>
-    <w:p>
-      <w:pPr>
-        <w:jc w:val="both"/>
-        <w:rPr>
-          <w:rFonts w:ascii="Times New Roman" w:hAnsi="Times New Roman" w:cs="Times New Roman"/>
-          <w:b/>
-          <w:sz w:val="24"/>
-          <w:szCs w:val="24"/>
-        </w:rPr>
-      </w:pPr>
-      <w:r>
-        <w:rPr>
-          <w:rFonts w:ascii="Times New Roman" w:hAnsi="Times New Roman" w:cs="Times New Roman"/>
-          <w:b/>
-          <w:sz w:val="24"/>
-          <w:szCs w:val="24"/>
-        </w:rPr>
-        <w:t xml:space="preserve">Proteger rutas con </w:t>
-      </w:r>
-      <w:proofErr w:type="spellStart"/>
-      <w:r>
-        <w:rPr>
-          <w:rFonts w:ascii="Times New Roman" w:hAnsi="Times New Roman" w:cs="Times New Roman"/>
-          <w:b/>
-          <w:sz w:val="24"/>
-          <w:szCs w:val="24"/>
-        </w:rPr>
-        <w:t>token</w:t>
-      </w:r>
-      <w:proofErr w:type="spellEnd"/>
-      <w:r>
-        <w:rPr>
-          <w:rFonts w:ascii="Times New Roman" w:hAnsi="Times New Roman" w:cs="Times New Roman"/>
-          <w:b/>
-          <w:sz w:val="24"/>
-          <w:szCs w:val="24"/>
-        </w:rPr>
-        <w:t xml:space="preserve"> (middleware) </w:t>
-      </w:r>
-    </w:p>
-    <w:p>
-      <w:pPr>
-        <w:jc w:val="both"/>
-        <w:rPr>
-          <w:rFonts w:ascii="Times New Roman" w:hAnsi="Times New Roman" w:cs="Times New Roman"/>
-          <w:b/>
-          <w:sz w:val="24"/>
-          <w:szCs w:val="24"/>
-        </w:rPr>
-      </w:pPr>
-      <w:r>
-        <w:rPr>
-          <w:rFonts w:ascii="Times New Roman" w:hAnsi="Times New Roman" w:cs="Times New Roman"/>
-          <w:b/>
-          <w:sz w:val="24"/>
-          <w:szCs w:val="24"/>
-        </w:rPr>
-        <w:lastRenderedPageBreak/>
+    </w:p>
+    <w:p>
+      <w:pPr>
+        <w:jc w:val="both"/>
+        <w:rPr>
+          <w:rFonts w:ascii="Times New Roman" w:hAnsi="Times New Roman" w:cs="Times New Roman"/>
+          <w:b/>
+          <w:sz w:val="24"/>
+          <w:szCs w:val="24"/>
+        </w:rPr>
+      </w:pPr>
+      <w:r>
+        <w:rPr>
+          <w:rFonts w:ascii="Times New Roman" w:hAnsi="Times New Roman" w:cs="Times New Roman"/>
+          <w:b/>
+          <w:noProof/>
+          <w:sz w:val="24"/>
+          <w:szCs w:val="24"/>
+          <w:lang w:eastAsia="es-EC"/>
+        </w:rPr>
         <w:drawing>
-          <wp:inline distT="0" distB="0" distL="0" distR="0" wp14:anchorId="30409534" wp14:editId="3406CDD0">
-            <wp:extent cx="5770641" cy="3688080"/>
-            <wp:effectExtent l="0" t="0" r="1905" b="7620"/>
-            <wp:docPr id="3" name="Imagen 3"/>
+          <wp:inline distT="0" distB="0" distL="0" distR="0" wp14:anchorId="0DB33C2F" wp14:editId="301895F1">
+            <wp:extent cx="6046907" cy="2847109"/>
+            <wp:effectExtent l="0" t="0" r="0" b="0"/>
+            <wp:docPr id="9" name="Imagen 9"/>
             <wp:cNvGraphicFramePr>
               <a:graphicFrameLocks xmlns:a="http://schemas.openxmlformats.org/drawingml/2006/main" noChangeAspect="1"/>
             </wp:cNvGraphicFramePr>
@@ -897,7 +860,7 @@
                   <pic:spPr>
                     <a:xfrm>
                       <a:off x="0" y="0"/>
-                      <a:ext cx="5772654" cy="3689367"/>
+                      <a:ext cx="6053915" cy="2850408"/>
                     </a:xfrm>
                     <a:prstGeom prst="rect">
                       <a:avLst/>
@@ -918,30 +881,19 @@
           <w:b/>
           <w:sz w:val="24"/>
           <w:szCs w:val="24"/>
-        </w:rPr>
-      </w:pPr>
-    </w:p>
-    <w:p>
-      <w:pPr>
-        <w:jc w:val="both"/>
-        <w:rPr>
-          <w:rFonts w:ascii="Times New Roman" w:hAnsi="Times New Roman" w:cs="Times New Roman"/>
-          <w:b/>
-          <w:sz w:val="24"/>
-          <w:szCs w:val="24"/>
-        </w:rPr>
-      </w:pPr>
-    </w:p>
-    <w:p>
-      <w:pPr>
-        <w:jc w:val="both"/>
-        <w:rPr>
-          <w:rFonts w:ascii="Times New Roman" w:hAnsi="Times New Roman" w:cs="Times New Roman"/>
-          <w:b/>
-          <w:sz w:val="24"/>
-          <w:szCs w:val="24"/>
-        </w:rPr>
-      </w:pPr>
+          <w:lang w:val="en-US"/>
+        </w:rPr>
+      </w:pPr>
+      <w:r>
+        <w:rPr>
+          <w:rFonts w:ascii="Times New Roman" w:hAnsi="Times New Roman" w:cs="Times New Roman"/>
+          <w:b/>
+          <w:sz w:val="24"/>
+          <w:szCs w:val="24"/>
+          <w:lang w:val="en-US"/>
+        </w:rPr>
+        <w:t>Refresh token → /</w:t>
+      </w:r>
       <w:proofErr w:type="spellStart"/>
       <w:r>
         <w:rPr>
@@ -949,8 +901,9 @@
           <w:b/>
           <w:sz w:val="24"/>
           <w:szCs w:val="24"/>
-        </w:rPr>
-        <w:t>Solucion</w:t>
+          <w:lang w:val="en-US"/>
+        </w:rPr>
+        <w:t>auth</w:t>
       </w:r>
       <w:proofErr w:type="spellEnd"/>
       <w:r>
@@ -959,43 +912,35 @@
           <w:b/>
           <w:sz w:val="24"/>
           <w:szCs w:val="24"/>
-        </w:rPr>
-        <w:t xml:space="preserve"> </w:t>
-      </w:r>
-      <w:proofErr w:type="spellStart"/>
-      <w:r>
-        <w:rPr>
-          <w:rFonts w:ascii="Times New Roman" w:hAnsi="Times New Roman" w:cs="Times New Roman"/>
-          <w:b/>
-          <w:sz w:val="24"/>
-          <w:szCs w:val="24"/>
-        </w:rPr>
-        <w:t>ModuleNotFoundError</w:t>
-      </w:r>
-      <w:proofErr w:type="spellEnd"/>
-    </w:p>
-    <w:p>
-      <w:pPr>
-        <w:jc w:val="both"/>
-        <w:rPr>
-          <w:rFonts w:ascii="Times New Roman" w:hAnsi="Times New Roman" w:cs="Times New Roman"/>
-          <w:b/>
-          <w:sz w:val="24"/>
-          <w:szCs w:val="24"/>
-        </w:rPr>
-      </w:pPr>
-      <w:r>
-        <w:rPr>
-          <w:rFonts w:ascii="Times New Roman" w:hAnsi="Times New Roman" w:cs="Times New Roman"/>
-          <w:b/>
-          <w:sz w:val="24"/>
-          <w:szCs w:val="24"/>
+          <w:lang w:val="en-US"/>
+        </w:rPr>
+        <w:t xml:space="preserve">/refresh </w:t>
+      </w:r>
+    </w:p>
+    <w:p>
+      <w:pPr>
+        <w:jc w:val="both"/>
+        <w:rPr>
+          <w:rFonts w:ascii="Times New Roman" w:hAnsi="Times New Roman" w:cs="Times New Roman"/>
+          <w:b/>
+          <w:sz w:val="24"/>
+          <w:szCs w:val="24"/>
+          <w:lang w:val="en-US"/>
+        </w:rPr>
+      </w:pPr>
+      <w:r>
+        <w:rPr>
+          <w:rFonts w:ascii="Times New Roman" w:hAnsi="Times New Roman" w:cs="Times New Roman"/>
+          <w:b/>
+          <w:sz w:val="24"/>
+          <w:szCs w:val="24"/>
+          <w:lang w:val="en-US"/>
         </w:rPr>
         <w:drawing>
-          <wp:inline distT="0" distB="0" distL="0" distR="0" wp14:anchorId="28CFD61C" wp14:editId="7A2D7D63">
-            <wp:extent cx="5400040" cy="3448685"/>
-            <wp:effectExtent l="0" t="0" r="0" b="0"/>
-            <wp:docPr id="4" name="Imagen 4"/>
+          <wp:inline distT="0" distB="0" distL="0" distR="0" wp14:anchorId="5C4B15B5" wp14:editId="6972459C">
+            <wp:extent cx="6008444" cy="2798618"/>
+            <wp:effectExtent l="0" t="0" r="0" b="1905"/>
+            <wp:docPr id="11" name="Imagen 11"/>
             <wp:cNvGraphicFramePr>
               <a:graphicFrameLocks xmlns:a="http://schemas.openxmlformats.org/drawingml/2006/main" noChangeAspect="1"/>
             </wp:cNvGraphicFramePr>
@@ -1015,7 +960,7 @@
                   <pic:spPr>
                     <a:xfrm>
                       <a:off x="0" y="0"/>
-                      <a:ext cx="5400040" cy="3448685"/>
+                      <a:ext cx="6013436" cy="2800943"/>
                     </a:xfrm>
                     <a:prstGeom prst="rect">
                       <a:avLst/>
@@ -1036,31 +981,103 @@
           <w:b/>
           <w:sz w:val="24"/>
           <w:szCs w:val="24"/>
-        </w:rPr>
-      </w:pPr>
-      <w:r>
-        <w:rPr>
-          <w:rFonts w:ascii="Times New Roman" w:hAnsi="Times New Roman" w:cs="Times New Roman"/>
-          <w:b/>
-          <w:sz w:val="24"/>
-          <w:szCs w:val="24"/>
-        </w:rPr>
-        <w:t>3. Crear TODA la base de datos</w:t>
-      </w:r>
-    </w:p>
-    <w:p>
-      <w:pPr>
-        <w:pStyle w:val="Prrafodelista"/>
-        <w:numPr>
-          <w:ilvl w:val="0"/>
-          <w:numId w:val="8"/>
-        </w:numPr>
-        <w:jc w:val="both"/>
-        <w:rPr>
-          <w:rFonts w:ascii="Times New Roman" w:hAnsi="Times New Roman" w:cs="Times New Roman"/>
-          <w:b/>
-          <w:sz w:val="24"/>
-          <w:szCs w:val="24"/>
+          <w:lang w:val="en-US"/>
+        </w:rPr>
+      </w:pPr>
+    </w:p>
+    <w:p>
+      <w:pPr>
+        <w:jc w:val="both"/>
+        <w:rPr>
+          <w:rFonts w:ascii="Times New Roman" w:hAnsi="Times New Roman" w:cs="Times New Roman"/>
+          <w:b/>
+          <w:sz w:val="24"/>
+          <w:szCs w:val="24"/>
+          <w:lang w:val="en-US"/>
+        </w:rPr>
+      </w:pPr>
+    </w:p>
+    <w:p>
+      <w:pPr>
+        <w:jc w:val="both"/>
+        <w:rPr>
+          <w:rFonts w:ascii="Times New Roman" w:hAnsi="Times New Roman" w:cs="Times New Roman"/>
+          <w:b/>
+          <w:sz w:val="24"/>
+          <w:szCs w:val="24"/>
+          <w:lang w:val="en-US"/>
+        </w:rPr>
+      </w:pPr>
+    </w:p>
+    <w:p>
+      <w:pPr>
+        <w:jc w:val="both"/>
+        <w:rPr>
+          <w:rFonts w:ascii="Times New Roman" w:hAnsi="Times New Roman" w:cs="Times New Roman"/>
+          <w:b/>
+          <w:sz w:val="24"/>
+          <w:szCs w:val="24"/>
+          <w:lang w:val="en-US"/>
+        </w:rPr>
+      </w:pPr>
+    </w:p>
+    <w:p>
+      <w:pPr>
+        <w:jc w:val="both"/>
+        <w:rPr>
+          <w:rFonts w:ascii="Times New Roman" w:hAnsi="Times New Roman" w:cs="Times New Roman"/>
+          <w:b/>
+          <w:sz w:val="24"/>
+          <w:szCs w:val="24"/>
+          <w:lang w:val="en-US"/>
+        </w:rPr>
+      </w:pPr>
+    </w:p>
+    <w:p>
+      <w:pPr>
+        <w:jc w:val="both"/>
+        <w:rPr>
+          <w:rFonts w:ascii="Times New Roman" w:hAnsi="Times New Roman" w:cs="Times New Roman"/>
+          <w:b/>
+          <w:sz w:val="24"/>
+          <w:szCs w:val="24"/>
+          <w:lang w:val="en-US"/>
+        </w:rPr>
+      </w:pPr>
+    </w:p>
+    <w:p>
+      <w:pPr>
+        <w:jc w:val="both"/>
+        <w:rPr>
+          <w:rFonts w:ascii="Times New Roman" w:hAnsi="Times New Roman" w:cs="Times New Roman"/>
+          <w:b/>
+          <w:sz w:val="24"/>
+          <w:szCs w:val="24"/>
+          <w:lang w:val="en-US"/>
+        </w:rPr>
+      </w:pPr>
+    </w:p>
+    <w:p>
+      <w:pPr>
+        <w:jc w:val="both"/>
+        <w:rPr>
+          <w:rFonts w:ascii="Times New Roman" w:hAnsi="Times New Roman" w:cs="Times New Roman"/>
+          <w:b/>
+          <w:sz w:val="24"/>
+          <w:szCs w:val="24"/>
+          <w:lang w:val="en-US"/>
+        </w:rPr>
+      </w:pPr>
+    </w:p>
+    <w:p>
+      <w:pPr>
+        <w:jc w:val="both"/>
+        <w:rPr>
+          <w:rFonts w:ascii="Times New Roman" w:hAnsi="Times New Roman" w:cs="Times New Roman"/>
+          <w:b/>
+          <w:sz w:val="24"/>
+          <w:szCs w:val="24"/>
+          <w:lang w:val="en-US"/>
         </w:rPr>
       </w:pPr>
       <w:proofErr w:type="spellStart"/>
@@ -1070,8 +1087,10 @@
           <w:b/>
           <w:sz w:val="24"/>
           <w:szCs w:val="24"/>
-        </w:rPr>
-        <w:t>users</w:t>
+          <w:lang w:val="en-US"/>
+        </w:rPr>
+        <w:lastRenderedPageBreak/>
+        <w:t>Proteger</w:t>
       </w:r>
       <w:proofErr w:type="spellEnd"/>
       <w:r>
@@ -1080,51 +1099,10 @@
           <w:b/>
           <w:sz w:val="24"/>
           <w:szCs w:val="24"/>
+          <w:lang w:val="en-US"/>
         </w:rPr>
         <w:t xml:space="preserve"> </w:t>
       </w:r>
-    </w:p>
-    <w:p>
-      <w:pPr>
-        <w:pStyle w:val="Prrafodelista"/>
-        <w:numPr>
-          <w:ilvl w:val="0"/>
-          <w:numId w:val="8"/>
-        </w:numPr>
-        <w:jc w:val="both"/>
-        <w:rPr>
-          <w:rFonts w:ascii="Times New Roman" w:hAnsi="Times New Roman" w:cs="Times New Roman"/>
-          <w:b/>
-          <w:sz w:val="24"/>
-          <w:szCs w:val="24"/>
-        </w:rPr>
-      </w:pPr>
-      <w:r>
-        <w:rPr>
-          <w:rFonts w:ascii="Times New Roman" w:hAnsi="Times New Roman" w:cs="Times New Roman"/>
-          <w:b/>
-          <w:sz w:val="24"/>
-          <w:szCs w:val="24"/>
-        </w:rPr>
-        <w:lastRenderedPageBreak/>
-        <w:t xml:space="preserve">restaurants </w:t>
-      </w:r>
-    </w:p>
-    <w:p>
-      <w:pPr>
-        <w:pStyle w:val="Prrafodelista"/>
-        <w:numPr>
-          <w:ilvl w:val="0"/>
-          <w:numId w:val="8"/>
-        </w:numPr>
-        <w:jc w:val="both"/>
-        <w:rPr>
-          <w:rFonts w:ascii="Times New Roman" w:hAnsi="Times New Roman" w:cs="Times New Roman"/>
-          <w:b/>
-          <w:sz w:val="24"/>
-          <w:szCs w:val="24"/>
-        </w:rPr>
-      </w:pPr>
       <w:proofErr w:type="spellStart"/>
       <w:r>
         <w:rPr>
@@ -1132,8 +1110,9 @@
           <w:b/>
           <w:sz w:val="24"/>
           <w:szCs w:val="24"/>
-        </w:rPr>
-        <w:t>invitation_codes</w:t>
+          <w:lang w:val="en-US"/>
+        </w:rPr>
+        <w:t>rutas</w:t>
       </w:r>
       <w:proofErr w:type="spellEnd"/>
       <w:r>
@@ -1142,176 +1121,35 @@
           <w:b/>
           <w:sz w:val="24"/>
           <w:szCs w:val="24"/>
-        </w:rPr>
-        <w:t xml:space="preserve"> </w:t>
-      </w:r>
-    </w:p>
-    <w:p>
-      <w:pPr>
-        <w:pStyle w:val="Prrafodelista"/>
-        <w:numPr>
-          <w:ilvl w:val="0"/>
-          <w:numId w:val="8"/>
-        </w:numPr>
-        <w:jc w:val="both"/>
-        <w:rPr>
-          <w:rFonts w:ascii="Times New Roman" w:hAnsi="Times New Roman" w:cs="Times New Roman"/>
-          <w:b/>
-          <w:sz w:val="24"/>
-          <w:szCs w:val="24"/>
-        </w:rPr>
-      </w:pPr>
-      <w:proofErr w:type="spellStart"/>
-      <w:r>
-        <w:rPr>
-          <w:rFonts w:ascii="Times New Roman" w:hAnsi="Times New Roman" w:cs="Times New Roman"/>
-          <w:b/>
-          <w:sz w:val="24"/>
-          <w:szCs w:val="24"/>
-        </w:rPr>
-        <w:t>companies</w:t>
-      </w:r>
-      <w:proofErr w:type="spellEnd"/>
-      <w:r>
-        <w:rPr>
-          <w:rFonts w:ascii="Times New Roman" w:hAnsi="Times New Roman" w:cs="Times New Roman"/>
-          <w:b/>
-          <w:sz w:val="24"/>
-          <w:szCs w:val="24"/>
-        </w:rPr>
-        <w:t xml:space="preserve"> </w:t>
-      </w:r>
-    </w:p>
-    <w:p>
-      <w:pPr>
-        <w:pStyle w:val="Prrafodelista"/>
-        <w:numPr>
-          <w:ilvl w:val="0"/>
-          <w:numId w:val="8"/>
-        </w:numPr>
-        <w:jc w:val="both"/>
-        <w:rPr>
-          <w:rFonts w:ascii="Times New Roman" w:hAnsi="Times New Roman" w:cs="Times New Roman"/>
-          <w:b/>
-          <w:sz w:val="24"/>
-          <w:szCs w:val="24"/>
-        </w:rPr>
-      </w:pPr>
-      <w:proofErr w:type="spellStart"/>
-      <w:r>
-        <w:rPr>
-          <w:rFonts w:ascii="Times New Roman" w:hAnsi="Times New Roman" w:cs="Times New Roman"/>
-          <w:b/>
-          <w:sz w:val="24"/>
-          <w:szCs w:val="24"/>
-        </w:rPr>
-        <w:t>agreements</w:t>
-      </w:r>
-      <w:proofErr w:type="spellEnd"/>
-      <w:r>
-        <w:rPr>
-          <w:rFonts w:ascii="Times New Roman" w:hAnsi="Times New Roman" w:cs="Times New Roman"/>
-          <w:b/>
-          <w:sz w:val="24"/>
-          <w:szCs w:val="24"/>
-        </w:rPr>
-        <w:t xml:space="preserve"> </w:t>
-      </w:r>
-    </w:p>
-    <w:p>
-      <w:pPr>
-        <w:pStyle w:val="Prrafodelista"/>
-        <w:numPr>
-          <w:ilvl w:val="0"/>
-          <w:numId w:val="8"/>
-        </w:numPr>
-        <w:jc w:val="both"/>
-        <w:rPr>
-          <w:rFonts w:ascii="Times New Roman" w:hAnsi="Times New Roman" w:cs="Times New Roman"/>
-          <w:b/>
-          <w:sz w:val="24"/>
-          <w:szCs w:val="24"/>
-        </w:rPr>
-      </w:pPr>
-      <w:proofErr w:type="spellStart"/>
-      <w:r>
-        <w:rPr>
-          <w:rFonts w:ascii="Times New Roman" w:hAnsi="Times New Roman" w:cs="Times New Roman"/>
-          <w:b/>
-          <w:sz w:val="24"/>
-          <w:szCs w:val="24"/>
-        </w:rPr>
-        <w:t>employees</w:t>
-      </w:r>
-      <w:proofErr w:type="spellEnd"/>
-      <w:r>
-        <w:rPr>
-          <w:rFonts w:ascii="Times New Roman" w:hAnsi="Times New Roman" w:cs="Times New Roman"/>
-          <w:b/>
-          <w:sz w:val="24"/>
-          <w:szCs w:val="24"/>
-        </w:rPr>
-        <w:t xml:space="preserve"> </w:t>
-      </w:r>
-    </w:p>
-    <w:p>
-      <w:pPr>
-        <w:pStyle w:val="Prrafodelista"/>
-        <w:numPr>
-          <w:ilvl w:val="0"/>
-          <w:numId w:val="8"/>
-        </w:numPr>
-        <w:jc w:val="both"/>
-        <w:rPr>
-          <w:rFonts w:ascii="Times New Roman" w:hAnsi="Times New Roman" w:cs="Times New Roman"/>
-          <w:b/>
-          <w:sz w:val="24"/>
-          <w:szCs w:val="24"/>
-        </w:rPr>
-      </w:pPr>
-      <w:proofErr w:type="spellStart"/>
-      <w:r>
-        <w:rPr>
-          <w:rFonts w:ascii="Times New Roman" w:hAnsi="Times New Roman" w:cs="Times New Roman"/>
-          <w:b/>
-          <w:sz w:val="24"/>
-          <w:szCs w:val="24"/>
-        </w:rPr>
-        <w:t>meal_logs</w:t>
-      </w:r>
-      <w:proofErr w:type="spellEnd"/>
-      <w:r>
-        <w:rPr>
-          <w:rFonts w:ascii="Times New Roman" w:hAnsi="Times New Roman" w:cs="Times New Roman"/>
-          <w:b/>
-          <w:sz w:val="24"/>
-          <w:szCs w:val="24"/>
-        </w:rPr>
-        <w:t xml:space="preserve"> </w:t>
-      </w:r>
-    </w:p>
-    <w:p>
-      <w:pPr>
-        <w:jc w:val="center"/>
-        <w:rPr>
-          <w:rFonts w:ascii="Times New Roman" w:hAnsi="Times New Roman" w:cs="Times New Roman"/>
-          <w:b/>
-          <w:sz w:val="24"/>
-          <w:szCs w:val="24"/>
-        </w:rPr>
-      </w:pPr>
-      <w:r>
-        <w:rPr>
-          <w:rFonts w:ascii="Times New Roman" w:hAnsi="Times New Roman" w:cs="Times New Roman"/>
-          <w:b/>
-          <w:sz w:val="24"/>
-          <w:szCs w:val="24"/>
+          <w:lang w:val="en-US"/>
+        </w:rPr>
+        <w:t xml:space="preserve"> con token (middleware) </w:t>
+      </w:r>
+    </w:p>
+    <w:p>
+      <w:pPr>
+        <w:jc w:val="both"/>
+        <w:rPr>
+          <w:rFonts w:ascii="Times New Roman" w:hAnsi="Times New Roman" w:cs="Times New Roman"/>
+          <w:b/>
+          <w:sz w:val="24"/>
+          <w:szCs w:val="24"/>
+        </w:rPr>
+      </w:pPr>
+      <w:r>
+        <w:rPr>
+          <w:rFonts w:ascii="Times New Roman" w:hAnsi="Times New Roman" w:cs="Times New Roman"/>
+          <w:b/>
+          <w:noProof/>
+          <w:sz w:val="24"/>
+          <w:szCs w:val="24"/>
+          <w:lang w:eastAsia="es-EC"/>
         </w:rPr>
         <w:drawing>
-          <wp:inline distT="0" distB="0" distL="0" distR="0" wp14:anchorId="1ED06D88" wp14:editId="45D3570E">
-            <wp:extent cx="3561795" cy="3002280"/>
-            <wp:effectExtent l="0" t="0" r="635" b="7620"/>
-            <wp:docPr id="6" name="Imagen 6"/>
+          <wp:inline distT="0" distB="0" distL="0" distR="0" wp14:anchorId="30409534" wp14:editId="3406CDD0">
+            <wp:extent cx="5770641" cy="3688080"/>
+            <wp:effectExtent l="0" t="0" r="1905" b="7620"/>
+            <wp:docPr id="3" name="Imagen 3"/>
             <wp:cNvGraphicFramePr>
               <a:graphicFrameLocks xmlns:a="http://schemas.openxmlformats.org/drawingml/2006/main" noChangeAspect="1"/>
             </wp:cNvGraphicFramePr>
@@ -1331,7 +1169,7 @@
                   <pic:spPr>
                     <a:xfrm>
                       <a:off x="0" y="0"/>
-                      <a:ext cx="3603444" cy="3037386"/>
+                      <a:ext cx="5772654" cy="3689367"/>
                     </a:xfrm>
                     <a:prstGeom prst="rect">
                       <a:avLst/>
@@ -1352,29 +1190,28 @@
           <w:b/>
           <w:sz w:val="24"/>
           <w:szCs w:val="24"/>
-          <w:lang w:val="en-US"/>
-        </w:rPr>
-      </w:pPr>
-      <w:r>
-        <w:rPr>
-          <w:rFonts w:ascii="Times New Roman" w:hAnsi="Times New Roman" w:cs="Times New Roman"/>
-          <w:b/>
-          <w:sz w:val="24"/>
-          <w:szCs w:val="24"/>
-          <w:lang w:val="en-US"/>
-        </w:rPr>
-        <w:t>5. Migrations (Alembic)</w:t>
-      </w:r>
-    </w:p>
-    <w:p>
-      <w:pPr>
-        <w:jc w:val="both"/>
-        <w:rPr>
-          <w:rFonts w:ascii="Times New Roman" w:hAnsi="Times New Roman" w:cs="Times New Roman"/>
-          <w:b/>
-          <w:sz w:val="24"/>
-          <w:szCs w:val="24"/>
-          <w:lang w:val="en-US"/>
+        </w:rPr>
+      </w:pPr>
+    </w:p>
+    <w:p>
+      <w:pPr>
+        <w:jc w:val="both"/>
+        <w:rPr>
+          <w:rFonts w:ascii="Times New Roman" w:hAnsi="Times New Roman" w:cs="Times New Roman"/>
+          <w:b/>
+          <w:sz w:val="24"/>
+          <w:szCs w:val="24"/>
+        </w:rPr>
+      </w:pPr>
+    </w:p>
+    <w:p>
+      <w:pPr>
+        <w:jc w:val="both"/>
+        <w:rPr>
+          <w:rFonts w:ascii="Times New Roman" w:hAnsi="Times New Roman" w:cs="Times New Roman"/>
+          <w:b/>
+          <w:sz w:val="24"/>
+          <w:szCs w:val="24"/>
         </w:rPr>
       </w:pPr>
       <w:proofErr w:type="spellStart"/>
@@ -1384,9 +1221,8 @@
           <w:b/>
           <w:sz w:val="24"/>
           <w:szCs w:val="24"/>
-          <w:lang w:val="en-US"/>
-        </w:rPr>
-        <w:t>Crear</w:t>
+        </w:rPr>
+        <w:t>Solucion</w:t>
       </w:r>
       <w:proofErr w:type="spellEnd"/>
       <w:r>
@@ -1395,7 +1231,6 @@
           <w:b/>
           <w:sz w:val="24"/>
           <w:szCs w:val="24"/>
-          <w:lang w:val="en-US"/>
         </w:rPr>
         <w:t xml:space="preserve"> </w:t>
       </w:r>
@@ -1406,282 +1241,35 @@
           <w:b/>
           <w:sz w:val="24"/>
           <w:szCs w:val="24"/>
-          <w:lang w:val="en-US"/>
-        </w:rPr>
-        <w:t>versiones</w:t>
+        </w:rPr>
+        <w:t>ModuleNotFoundError</w:t>
       </w:r>
       <w:proofErr w:type="spellEnd"/>
-      <w:r>
-        <w:rPr>
-          <w:rFonts w:ascii="Times New Roman" w:hAnsi="Times New Roman" w:cs="Times New Roman"/>
-          <w:b/>
-          <w:sz w:val="24"/>
-          <w:szCs w:val="24"/>
-          <w:lang w:val="en-US"/>
-        </w:rPr>
-        <w:t xml:space="preserve">: </w:t>
-      </w:r>
-    </w:p>
-    <w:p>
-      <w:pPr>
-        <w:jc w:val="both"/>
-        <w:rPr>
-          <w:rFonts w:ascii="Times New Roman" w:hAnsi="Times New Roman" w:cs="Times New Roman"/>
-          <w:b/>
-          <w:sz w:val="24"/>
-          <w:szCs w:val="24"/>
-          <w:lang w:val="en-US"/>
-        </w:rPr>
-      </w:pPr>
-      <w:r>
-        <w:rPr>
-          <w:rFonts w:ascii="Times New Roman" w:hAnsi="Times New Roman" w:cs="Times New Roman"/>
-          <w:b/>
-          <w:sz w:val="24"/>
-          <w:szCs w:val="24"/>
-          <w:lang w:val="en-US"/>
-        </w:rPr>
-        <w:t xml:space="preserve">v1 → users </w:t>
-      </w:r>
-    </w:p>
-    <w:p>
-      <w:pPr>
-        <w:jc w:val="both"/>
-        <w:rPr>
-          <w:rFonts w:ascii="Times New Roman" w:hAnsi="Times New Roman" w:cs="Times New Roman"/>
-          <w:b/>
-          <w:sz w:val="24"/>
-          <w:szCs w:val="24"/>
-          <w:lang w:val="en-US"/>
-        </w:rPr>
-      </w:pPr>
-      <w:r>
-        <w:rPr>
-          <w:rFonts w:ascii="Times New Roman" w:hAnsi="Times New Roman" w:cs="Times New Roman"/>
-          <w:b/>
-          <w:sz w:val="24"/>
-          <w:szCs w:val="24"/>
-          <w:lang w:val="en-US"/>
-        </w:rPr>
-        <w:t xml:space="preserve">v2 → restaurants </w:t>
-      </w:r>
-    </w:p>
-    <w:p>
-      <w:pPr>
-        <w:jc w:val="both"/>
-        <w:rPr>
-          <w:rFonts w:ascii="Times New Roman" w:hAnsi="Times New Roman" w:cs="Times New Roman"/>
-          <w:b/>
-          <w:sz w:val="24"/>
-          <w:szCs w:val="24"/>
-          <w:lang w:val="en-US"/>
-        </w:rPr>
-      </w:pPr>
-      <w:r>
-        <w:rPr>
-          <w:rFonts w:ascii="Times New Roman" w:hAnsi="Times New Roman" w:cs="Times New Roman"/>
-          <w:b/>
-          <w:sz w:val="24"/>
-          <w:szCs w:val="24"/>
-          <w:lang w:val="en-US"/>
-        </w:rPr>
-        <w:t xml:space="preserve">v3 → companies + invitations + agreements </w:t>
-      </w:r>
-    </w:p>
-    <w:p>
-      <w:pPr>
-        <w:jc w:val="both"/>
-        <w:rPr>
-          <w:rFonts w:ascii="Times New Roman" w:hAnsi="Times New Roman" w:cs="Times New Roman"/>
-          <w:b/>
-          <w:sz w:val="24"/>
-          <w:szCs w:val="24"/>
-          <w:lang w:val="en-US"/>
-        </w:rPr>
-      </w:pPr>
-      <w:r>
-        <w:rPr>
-          <w:rFonts w:ascii="Times New Roman" w:hAnsi="Times New Roman" w:cs="Times New Roman"/>
-          <w:b/>
-          <w:sz w:val="24"/>
-          <w:szCs w:val="24"/>
-          <w:lang w:val="en-US"/>
-        </w:rPr>
-        <w:t xml:space="preserve">v4 → employees + </w:t>
-      </w:r>
-      <w:proofErr w:type="spellStart"/>
-      <w:r>
-        <w:rPr>
-          <w:rFonts w:ascii="Times New Roman" w:hAnsi="Times New Roman" w:cs="Times New Roman"/>
-          <w:b/>
-          <w:sz w:val="24"/>
-          <w:szCs w:val="24"/>
-          <w:lang w:val="en-US"/>
-        </w:rPr>
-        <w:t>meal_logs</w:t>
-      </w:r>
-      <w:proofErr w:type="spellEnd"/>
-      <w:r>
-        <w:rPr>
-          <w:rFonts w:ascii="Times New Roman" w:hAnsi="Times New Roman" w:cs="Times New Roman"/>
-          <w:b/>
-          <w:sz w:val="24"/>
-          <w:szCs w:val="24"/>
-          <w:lang w:val="en-US"/>
-        </w:rPr>
-        <w:t xml:space="preserve"> </w:t>
-      </w:r>
-    </w:p>
-    <w:p>
-      <w:pPr>
-        <w:jc w:val="both"/>
-        <w:rPr>
-          <w:rFonts w:ascii="Times New Roman" w:hAnsi="Times New Roman" w:cs="Times New Roman"/>
-          <w:b/>
-          <w:sz w:val="24"/>
-          <w:szCs w:val="24"/>
-          <w:lang w:val="en-US"/>
-        </w:rPr>
-      </w:pPr>
-      <w:proofErr w:type="spellStart"/>
-      <w:r>
-        <w:rPr>
-          <w:rFonts w:ascii="Times New Roman" w:hAnsi="Times New Roman" w:cs="Times New Roman"/>
-          <w:b/>
-          <w:sz w:val="24"/>
-          <w:szCs w:val="24"/>
-          <w:lang w:val="en-US"/>
-        </w:rPr>
-        <w:t>Ejecutar</w:t>
-      </w:r>
-      <w:proofErr w:type="spellEnd"/>
-      <w:r>
-        <w:rPr>
-          <w:rFonts w:ascii="Times New Roman" w:hAnsi="Times New Roman" w:cs="Times New Roman"/>
-          <w:b/>
-          <w:sz w:val="24"/>
-          <w:szCs w:val="24"/>
-          <w:lang w:val="en-US"/>
-        </w:rPr>
-        <w:t xml:space="preserve"> migrations en </w:t>
-      </w:r>
-      <w:proofErr w:type="spellStart"/>
-      <w:r>
-        <w:rPr>
-          <w:rFonts w:ascii="Times New Roman" w:hAnsi="Times New Roman" w:cs="Times New Roman"/>
-          <w:b/>
-          <w:sz w:val="24"/>
-          <w:szCs w:val="24"/>
-          <w:lang w:val="en-US"/>
-        </w:rPr>
-        <w:t>PostgreSQL</w:t>
-      </w:r>
-      <w:proofErr w:type="spellEnd"/>
-      <w:r>
-        <w:rPr>
-          <w:rFonts w:ascii="Times New Roman" w:hAnsi="Times New Roman" w:cs="Times New Roman"/>
-          <w:b/>
-          <w:sz w:val="24"/>
-          <w:szCs w:val="24"/>
-          <w:lang w:val="en-US"/>
-        </w:rPr>
-        <w:t xml:space="preserve"> </w:t>
-      </w:r>
-    </w:p>
-    <w:p>
-      <w:pPr>
-        <w:jc w:val="both"/>
-        <w:rPr>
-          <w:rFonts w:ascii="Times New Roman" w:hAnsi="Times New Roman" w:cs="Times New Roman"/>
-          <w:b/>
-          <w:sz w:val="24"/>
-          <w:szCs w:val="24"/>
-        </w:rPr>
-      </w:pPr>
-      <w:r>
-        <w:rPr>
-          <w:rFonts w:ascii="Times New Roman" w:hAnsi="Times New Roman" w:cs="Times New Roman"/>
-          <w:b/>
-          <w:sz w:val="24"/>
-          <w:szCs w:val="24"/>
-        </w:rPr>
-        <w:t>Objetivo de la fase 1</w:t>
-      </w:r>
-    </w:p>
-    <w:p>
-      <w:pPr>
-        <w:jc w:val="both"/>
-        <w:rPr>
-          <w:rFonts w:ascii="Times New Roman" w:hAnsi="Times New Roman" w:cs="Times New Roman"/>
-          <w:b/>
-          <w:sz w:val="24"/>
-          <w:szCs w:val="24"/>
-        </w:rPr>
-      </w:pPr>
-      <w:r>
-        <w:rPr>
-          <w:rFonts w:ascii="Times New Roman" w:hAnsi="Times New Roman" w:cs="Times New Roman"/>
-          <w:b/>
-          <w:sz w:val="24"/>
-          <w:szCs w:val="24"/>
-        </w:rPr>
-        <w:t>Dejar listo:</w:t>
-      </w:r>
-    </w:p>
-    <w:p>
-      <w:pPr>
-        <w:jc w:val="both"/>
-        <w:rPr>
-          <w:rFonts w:ascii="Times New Roman" w:hAnsi="Times New Roman" w:cs="Times New Roman"/>
-          <w:b/>
-          <w:sz w:val="24"/>
-          <w:szCs w:val="24"/>
-        </w:rPr>
-      </w:pPr>
-      <w:proofErr w:type="spellStart"/>
-      <w:r>
-        <w:rPr>
-          <w:rFonts w:ascii="Times New Roman" w:hAnsi="Times New Roman" w:cs="Times New Roman"/>
-          <w:b/>
-          <w:sz w:val="24"/>
-          <w:szCs w:val="24"/>
-        </w:rPr>
-        <w:t>Login</w:t>
-      </w:r>
-      <w:proofErr w:type="spellEnd"/>
-      <w:r>
-        <w:rPr>
-          <w:rFonts w:ascii="Times New Roman" w:hAnsi="Times New Roman" w:cs="Times New Roman"/>
-          <w:b/>
-          <w:sz w:val="24"/>
-          <w:szCs w:val="24"/>
-        </w:rPr>
-        <w:t xml:space="preserve"> funcionando </w:t>
-      </w:r>
-    </w:p>
-    <w:p>
-      <w:pPr>
-        <w:jc w:val="both"/>
-        <w:rPr>
-          <w:rFonts w:ascii="Times New Roman" w:hAnsi="Times New Roman" w:cs="Times New Roman"/>
-          <w:b/>
-          <w:sz w:val="24"/>
-          <w:szCs w:val="24"/>
-        </w:rPr>
-      </w:pPr>
-      <w:r>
-        <w:rPr>
-          <w:rFonts w:ascii="Times New Roman" w:hAnsi="Times New Roman" w:cs="Times New Roman"/>
-          <w:b/>
-          <w:sz w:val="24"/>
-          <w:szCs w:val="24"/>
-        </w:rPr>
-        <w:lastRenderedPageBreak/>
+    </w:p>
+    <w:p>
+      <w:pPr>
+        <w:jc w:val="both"/>
+        <w:rPr>
+          <w:rFonts w:ascii="Times New Roman" w:hAnsi="Times New Roman" w:cs="Times New Roman"/>
+          <w:b/>
+          <w:sz w:val="24"/>
+          <w:szCs w:val="24"/>
+        </w:rPr>
+      </w:pPr>
+      <w:r>
+        <w:rPr>
+          <w:rFonts w:ascii="Times New Roman" w:hAnsi="Times New Roman" w:cs="Times New Roman"/>
+          <w:b/>
+          <w:noProof/>
+          <w:sz w:val="24"/>
+          <w:szCs w:val="24"/>
+          <w:lang w:eastAsia="es-EC"/>
+        </w:rPr>
         <w:drawing>
-          <wp:inline distT="0" distB="0" distL="0" distR="0" wp14:anchorId="38E21C67" wp14:editId="245EDB7F">
-            <wp:extent cx="5400040" cy="2506980"/>
-            <wp:effectExtent l="0" t="0" r="0" b="7620"/>
-            <wp:docPr id="7" name="Imagen 7"/>
+          <wp:inline distT="0" distB="0" distL="0" distR="0" wp14:anchorId="28CFD61C" wp14:editId="7A2D7D63">
+            <wp:extent cx="5400040" cy="3448685"/>
+            <wp:effectExtent l="0" t="0" r="0" b="0"/>
+            <wp:docPr id="4" name="Imagen 4"/>
             <wp:cNvGraphicFramePr>
               <a:graphicFrameLocks xmlns:a="http://schemas.openxmlformats.org/drawingml/2006/main" noChangeAspect="1"/>
             </wp:cNvGraphicFramePr>
@@ -1701,7 +1289,7 @@
                   <pic:spPr>
                     <a:xfrm>
                       <a:off x="0" y="0"/>
-                      <a:ext cx="5400040" cy="2506980"/>
+                      <a:ext cx="5400040" cy="3448685"/>
                     </a:xfrm>
                     <a:prstGeom prst="rect">
                       <a:avLst/>
@@ -1724,38 +1312,293 @@
           <w:szCs w:val="24"/>
         </w:rPr>
       </w:pPr>
-      <w:r>
-        <w:rPr>
-          <w:rFonts w:ascii="Times New Roman" w:hAnsi="Times New Roman" w:cs="Times New Roman"/>
-          <w:b/>
-          <w:sz w:val="24"/>
-          <w:szCs w:val="24"/>
-        </w:rPr>
-        <w:t xml:space="preserve">Base de datos completa </w:t>
-      </w:r>
-    </w:p>
-    <w:p>
-      <w:pPr>
-        <w:jc w:val="both"/>
-        <w:rPr>
-          <w:rFonts w:ascii="Times New Roman" w:hAnsi="Times New Roman" w:cs="Times New Roman"/>
-          <w:b/>
-          <w:sz w:val="24"/>
-          <w:szCs w:val="24"/>
-        </w:rPr>
-      </w:pPr>
-      <w:r>
-        <w:rPr>
-          <w:rFonts w:ascii="Times New Roman" w:hAnsi="Times New Roman" w:cs="Times New Roman"/>
-          <w:b/>
-          <w:sz w:val="24"/>
-          <w:szCs w:val="24"/>
+    </w:p>
+    <w:p>
+      <w:pPr>
+        <w:jc w:val="both"/>
+        <w:rPr>
+          <w:rFonts w:ascii="Times New Roman" w:hAnsi="Times New Roman" w:cs="Times New Roman"/>
+          <w:b/>
+          <w:sz w:val="24"/>
+          <w:szCs w:val="24"/>
+        </w:rPr>
+      </w:pPr>
+      <w:r>
+        <w:rPr>
+          <w:rFonts w:ascii="Times New Roman" w:hAnsi="Times New Roman" w:cs="Times New Roman"/>
+          <w:b/>
+          <w:sz w:val="24"/>
+          <w:szCs w:val="24"/>
+        </w:rPr>
+        <w:lastRenderedPageBreak/>
+        <w:t>3. Crear TODA la base de datos</w:t>
+      </w:r>
+    </w:p>
+    <w:p>
+      <w:pPr>
+        <w:pStyle w:val="Prrafodelista"/>
+        <w:numPr>
+          <w:ilvl w:val="0"/>
+          <w:numId w:val="8"/>
+        </w:numPr>
+        <w:jc w:val="both"/>
+        <w:rPr>
+          <w:rFonts w:ascii="Times New Roman" w:hAnsi="Times New Roman" w:cs="Times New Roman"/>
+          <w:b/>
+          <w:sz w:val="24"/>
+          <w:szCs w:val="24"/>
+        </w:rPr>
+      </w:pPr>
+      <w:proofErr w:type="spellStart"/>
+      <w:r>
+        <w:rPr>
+          <w:rFonts w:ascii="Times New Roman" w:hAnsi="Times New Roman" w:cs="Times New Roman"/>
+          <w:b/>
+          <w:sz w:val="24"/>
+          <w:szCs w:val="24"/>
+        </w:rPr>
+        <w:t>users</w:t>
+      </w:r>
+      <w:proofErr w:type="spellEnd"/>
+      <w:r>
+        <w:rPr>
+          <w:rFonts w:ascii="Times New Roman" w:hAnsi="Times New Roman" w:cs="Times New Roman"/>
+          <w:b/>
+          <w:sz w:val="24"/>
+          <w:szCs w:val="24"/>
+        </w:rPr>
+        <w:t xml:space="preserve"> </w:t>
+      </w:r>
+    </w:p>
+    <w:p>
+      <w:pPr>
+        <w:pStyle w:val="Prrafodelista"/>
+        <w:numPr>
+          <w:ilvl w:val="0"/>
+          <w:numId w:val="8"/>
+        </w:numPr>
+        <w:jc w:val="both"/>
+        <w:rPr>
+          <w:rFonts w:ascii="Times New Roman" w:hAnsi="Times New Roman" w:cs="Times New Roman"/>
+          <w:b/>
+          <w:sz w:val="24"/>
+          <w:szCs w:val="24"/>
+        </w:rPr>
+      </w:pPr>
+      <w:r>
+        <w:rPr>
+          <w:rFonts w:ascii="Times New Roman" w:hAnsi="Times New Roman" w:cs="Times New Roman"/>
+          <w:b/>
+          <w:sz w:val="24"/>
+          <w:szCs w:val="24"/>
+        </w:rPr>
+        <w:t xml:space="preserve">restaurants </w:t>
+      </w:r>
+    </w:p>
+    <w:p>
+      <w:pPr>
+        <w:pStyle w:val="Prrafodelista"/>
+        <w:numPr>
+          <w:ilvl w:val="0"/>
+          <w:numId w:val="8"/>
+        </w:numPr>
+        <w:jc w:val="both"/>
+        <w:rPr>
+          <w:rFonts w:ascii="Times New Roman" w:hAnsi="Times New Roman" w:cs="Times New Roman"/>
+          <w:b/>
+          <w:sz w:val="24"/>
+          <w:szCs w:val="24"/>
+        </w:rPr>
+      </w:pPr>
+      <w:proofErr w:type="spellStart"/>
+      <w:r>
+        <w:rPr>
+          <w:rFonts w:ascii="Times New Roman" w:hAnsi="Times New Roman" w:cs="Times New Roman"/>
+          <w:b/>
+          <w:sz w:val="24"/>
+          <w:szCs w:val="24"/>
+        </w:rPr>
+        <w:t>invitation_codes</w:t>
+      </w:r>
+      <w:proofErr w:type="spellEnd"/>
+      <w:r>
+        <w:rPr>
+          <w:rFonts w:ascii="Times New Roman" w:hAnsi="Times New Roman" w:cs="Times New Roman"/>
+          <w:b/>
+          <w:sz w:val="24"/>
+          <w:szCs w:val="24"/>
+        </w:rPr>
+        <w:t xml:space="preserve"> </w:t>
+      </w:r>
+    </w:p>
+    <w:p>
+      <w:pPr>
+        <w:pStyle w:val="Prrafodelista"/>
+        <w:numPr>
+          <w:ilvl w:val="0"/>
+          <w:numId w:val="8"/>
+        </w:numPr>
+        <w:jc w:val="both"/>
+        <w:rPr>
+          <w:rFonts w:ascii="Times New Roman" w:hAnsi="Times New Roman" w:cs="Times New Roman"/>
+          <w:b/>
+          <w:sz w:val="24"/>
+          <w:szCs w:val="24"/>
+        </w:rPr>
+      </w:pPr>
+      <w:proofErr w:type="spellStart"/>
+      <w:r>
+        <w:rPr>
+          <w:rFonts w:ascii="Times New Roman" w:hAnsi="Times New Roman" w:cs="Times New Roman"/>
+          <w:b/>
+          <w:sz w:val="24"/>
+          <w:szCs w:val="24"/>
+        </w:rPr>
+        <w:t>companies</w:t>
+      </w:r>
+      <w:proofErr w:type="spellEnd"/>
+      <w:r>
+        <w:rPr>
+          <w:rFonts w:ascii="Times New Roman" w:hAnsi="Times New Roman" w:cs="Times New Roman"/>
+          <w:b/>
+          <w:sz w:val="24"/>
+          <w:szCs w:val="24"/>
+        </w:rPr>
+        <w:t xml:space="preserve"> </w:t>
+      </w:r>
+    </w:p>
+    <w:p>
+      <w:pPr>
+        <w:pStyle w:val="Prrafodelista"/>
+        <w:numPr>
+          <w:ilvl w:val="0"/>
+          <w:numId w:val="8"/>
+        </w:numPr>
+        <w:jc w:val="both"/>
+        <w:rPr>
+          <w:rFonts w:ascii="Times New Roman" w:hAnsi="Times New Roman" w:cs="Times New Roman"/>
+          <w:b/>
+          <w:sz w:val="24"/>
+          <w:szCs w:val="24"/>
+        </w:rPr>
+      </w:pPr>
+      <w:proofErr w:type="spellStart"/>
+      <w:r>
+        <w:rPr>
+          <w:rFonts w:ascii="Times New Roman" w:hAnsi="Times New Roman" w:cs="Times New Roman"/>
+          <w:b/>
+          <w:sz w:val="24"/>
+          <w:szCs w:val="24"/>
+        </w:rPr>
+        <w:t>agreements</w:t>
+      </w:r>
+      <w:proofErr w:type="spellEnd"/>
+      <w:r>
+        <w:rPr>
+          <w:rFonts w:ascii="Times New Roman" w:hAnsi="Times New Roman" w:cs="Times New Roman"/>
+          <w:b/>
+          <w:sz w:val="24"/>
+          <w:szCs w:val="24"/>
+        </w:rPr>
+        <w:t xml:space="preserve"> </w:t>
+      </w:r>
+    </w:p>
+    <w:p>
+      <w:pPr>
+        <w:pStyle w:val="Prrafodelista"/>
+        <w:numPr>
+          <w:ilvl w:val="0"/>
+          <w:numId w:val="8"/>
+        </w:numPr>
+        <w:jc w:val="both"/>
+        <w:rPr>
+          <w:rFonts w:ascii="Times New Roman" w:hAnsi="Times New Roman" w:cs="Times New Roman"/>
+          <w:b/>
+          <w:sz w:val="24"/>
+          <w:szCs w:val="24"/>
+        </w:rPr>
+      </w:pPr>
+      <w:proofErr w:type="spellStart"/>
+      <w:r>
+        <w:rPr>
+          <w:rFonts w:ascii="Times New Roman" w:hAnsi="Times New Roman" w:cs="Times New Roman"/>
+          <w:b/>
+          <w:sz w:val="24"/>
+          <w:szCs w:val="24"/>
+        </w:rPr>
+        <w:t>employees</w:t>
+      </w:r>
+      <w:proofErr w:type="spellEnd"/>
+      <w:r>
+        <w:rPr>
+          <w:rFonts w:ascii="Times New Roman" w:hAnsi="Times New Roman" w:cs="Times New Roman"/>
+          <w:b/>
+          <w:sz w:val="24"/>
+          <w:szCs w:val="24"/>
+        </w:rPr>
+        <w:t xml:space="preserve"> </w:t>
+      </w:r>
+    </w:p>
+    <w:p>
+      <w:pPr>
+        <w:pStyle w:val="Prrafodelista"/>
+        <w:numPr>
+          <w:ilvl w:val="0"/>
+          <w:numId w:val="8"/>
+        </w:numPr>
+        <w:jc w:val="both"/>
+        <w:rPr>
+          <w:rFonts w:ascii="Times New Roman" w:hAnsi="Times New Roman" w:cs="Times New Roman"/>
+          <w:b/>
+          <w:sz w:val="24"/>
+          <w:szCs w:val="24"/>
+        </w:rPr>
+      </w:pPr>
+      <w:proofErr w:type="spellStart"/>
+      <w:r>
+        <w:rPr>
+          <w:rFonts w:ascii="Times New Roman" w:hAnsi="Times New Roman" w:cs="Times New Roman"/>
+          <w:b/>
+          <w:sz w:val="24"/>
+          <w:szCs w:val="24"/>
+        </w:rPr>
+        <w:t>meal_logs</w:t>
+      </w:r>
+      <w:proofErr w:type="spellEnd"/>
+      <w:r>
+        <w:rPr>
+          <w:rFonts w:ascii="Times New Roman" w:hAnsi="Times New Roman" w:cs="Times New Roman"/>
+          <w:b/>
+          <w:sz w:val="24"/>
+          <w:szCs w:val="24"/>
+        </w:rPr>
+        <w:t xml:space="preserve"> </w:t>
+      </w:r>
+    </w:p>
+    <w:p>
+      <w:pPr>
+        <w:jc w:val="center"/>
+        <w:rPr>
+          <w:rFonts w:ascii="Times New Roman" w:hAnsi="Times New Roman" w:cs="Times New Roman"/>
+          <w:b/>
+          <w:sz w:val="24"/>
+          <w:szCs w:val="24"/>
+        </w:rPr>
+      </w:pPr>
+      <w:r>
+        <w:rPr>
+          <w:rFonts w:ascii="Times New Roman" w:hAnsi="Times New Roman" w:cs="Times New Roman"/>
+          <w:b/>
+          <w:noProof/>
+          <w:sz w:val="24"/>
+          <w:szCs w:val="24"/>
+          <w:lang w:eastAsia="es-EC"/>
         </w:rPr>
         <w:drawing>
-          <wp:inline distT="0" distB="0" distL="0" distR="0" wp14:anchorId="590E9FF7" wp14:editId="3F34E723">
-            <wp:extent cx="5400040" cy="995045"/>
-            <wp:effectExtent l="0" t="0" r="0" b="0"/>
-            <wp:docPr id="8" name="Imagen 8"/>
+          <wp:inline distT="0" distB="0" distL="0" distR="0" wp14:anchorId="1ED06D88" wp14:editId="45D3570E">
+            <wp:extent cx="3561795" cy="3002280"/>
+            <wp:effectExtent l="0" t="0" r="635" b="7620"/>
+            <wp:docPr id="6" name="Imagen 6"/>
             <wp:cNvGraphicFramePr>
               <a:graphicFrameLocks xmlns:a="http://schemas.openxmlformats.org/drawingml/2006/main" noChangeAspect="1"/>
             </wp:cNvGraphicFramePr>
@@ -1775,6 +1618,181 @@
                   <pic:spPr>
                     <a:xfrm>
                       <a:off x="0" y="0"/>
+                      <a:ext cx="3603444" cy="3037386"/>
+                    </a:xfrm>
+                    <a:prstGeom prst="rect">
+                      <a:avLst/>
+                    </a:prstGeom>
+                  </pic:spPr>
+                </pic:pic>
+              </a:graphicData>
+            </a:graphic>
+          </wp:inline>
+        </w:drawing>
+      </w:r>
+    </w:p>
+    <w:p>
+      <w:pPr>
+        <w:jc w:val="center"/>
+        <w:rPr>
+          <w:rFonts w:ascii="Times New Roman" w:hAnsi="Times New Roman" w:cs="Times New Roman"/>
+          <w:b/>
+          <w:sz w:val="24"/>
+          <w:szCs w:val="24"/>
+        </w:rPr>
+      </w:pPr>
+    </w:p>
+    <w:p>
+      <w:pPr>
+        <w:jc w:val="both"/>
+        <w:rPr>
+          <w:rFonts w:ascii="Times New Roman" w:hAnsi="Times New Roman" w:cs="Times New Roman"/>
+          <w:b/>
+          <w:sz w:val="24"/>
+          <w:szCs w:val="24"/>
+        </w:rPr>
+      </w:pPr>
+      <w:proofErr w:type="spellStart"/>
+      <w:r>
+        <w:rPr>
+          <w:rFonts w:ascii="Times New Roman" w:hAnsi="Times New Roman" w:cs="Times New Roman"/>
+          <w:b/>
+          <w:sz w:val="24"/>
+          <w:szCs w:val="24"/>
+        </w:rPr>
+        <w:t>Login</w:t>
+      </w:r>
+      <w:proofErr w:type="spellEnd"/>
+      <w:r>
+        <w:rPr>
+          <w:rFonts w:ascii="Times New Roman" w:hAnsi="Times New Roman" w:cs="Times New Roman"/>
+          <w:b/>
+          <w:sz w:val="24"/>
+          <w:szCs w:val="24"/>
+        </w:rPr>
+        <w:t xml:space="preserve"> funcionando </w:t>
+      </w:r>
+    </w:p>
+    <w:p>
+      <w:pPr>
+        <w:jc w:val="both"/>
+        <w:rPr>
+          <w:rFonts w:ascii="Times New Roman" w:hAnsi="Times New Roman" w:cs="Times New Roman"/>
+          <w:b/>
+          <w:sz w:val="24"/>
+          <w:szCs w:val="24"/>
+        </w:rPr>
+      </w:pPr>
+      <w:r>
+        <w:rPr>
+          <w:rFonts w:ascii="Times New Roman" w:hAnsi="Times New Roman" w:cs="Times New Roman"/>
+          <w:b/>
+          <w:noProof/>
+          <w:sz w:val="24"/>
+          <w:szCs w:val="24"/>
+          <w:lang w:eastAsia="es-EC"/>
+        </w:rPr>
+        <w:drawing>
+          <wp:inline distT="0" distB="0" distL="0" distR="0" wp14:anchorId="38E21C67" wp14:editId="245EDB7F">
+            <wp:extent cx="5400040" cy="2506980"/>
+            <wp:effectExtent l="0" t="0" r="0" b="7620"/>
+            <wp:docPr id="7" name="Imagen 7"/>
+            <wp:cNvGraphicFramePr>
+              <a:graphicFrameLocks xmlns:a="http://schemas.openxmlformats.org/drawingml/2006/main" noChangeAspect="1"/>
+            </wp:cNvGraphicFramePr>
+            <a:graphic xmlns:a="http://schemas.openxmlformats.org/drawingml/2006/main">
+              <a:graphicData uri="http://schemas.openxmlformats.org/drawingml/2006/picture">
+                <pic:pic xmlns:pic="http://schemas.openxmlformats.org/drawingml/2006/picture">
+                  <pic:nvPicPr>
+                    <pic:cNvPr id="1" name=""/>
+                    <pic:cNvPicPr/>
+                  </pic:nvPicPr>
+                  <pic:blipFill>
+                    <a:blip r:embed="rId14"/>
+                    <a:stretch>
+                      <a:fillRect/>
+                    </a:stretch>
+                  </pic:blipFill>
+                  <pic:spPr>
+                    <a:xfrm>
+                      <a:off x="0" y="0"/>
+                      <a:ext cx="5400040" cy="2506980"/>
+                    </a:xfrm>
+                    <a:prstGeom prst="rect">
+                      <a:avLst/>
+                    </a:prstGeom>
+                  </pic:spPr>
+                </pic:pic>
+              </a:graphicData>
+            </a:graphic>
+          </wp:inline>
+        </w:drawing>
+      </w:r>
+    </w:p>
+    <w:p>
+      <w:pPr>
+        <w:jc w:val="both"/>
+        <w:rPr>
+          <w:rFonts w:ascii="Times New Roman" w:hAnsi="Times New Roman" w:cs="Times New Roman"/>
+          <w:b/>
+          <w:sz w:val="24"/>
+          <w:szCs w:val="24"/>
+        </w:rPr>
+      </w:pPr>
+      <w:r>
+        <w:rPr>
+          <w:rFonts w:ascii="Times New Roman" w:hAnsi="Times New Roman" w:cs="Times New Roman"/>
+          <w:b/>
+          <w:sz w:val="24"/>
+          <w:szCs w:val="24"/>
+        </w:rPr>
+        <w:t xml:space="preserve">Base de datos completa </w:t>
+      </w:r>
+    </w:p>
+    <w:p>
+      <w:pPr>
+        <w:jc w:val="both"/>
+        <w:rPr>
+          <w:rFonts w:ascii="Times New Roman" w:hAnsi="Times New Roman" w:cs="Times New Roman"/>
+          <w:b/>
+          <w:sz w:val="24"/>
+          <w:szCs w:val="24"/>
+        </w:rPr>
+      </w:pPr>
+      <w:r>
+        <w:rPr>
+          <w:rFonts w:ascii="Times New Roman" w:hAnsi="Times New Roman" w:cs="Times New Roman"/>
+          <w:b/>
+          <w:noProof/>
+          <w:sz w:val="24"/>
+          <w:szCs w:val="24"/>
+          <w:lang w:eastAsia="es-EC"/>
+        </w:rPr>
+        <w:lastRenderedPageBreak/>
+        <w:drawing>
+          <wp:inline distT="0" distB="0" distL="0" distR="0" wp14:anchorId="590E9FF7" wp14:editId="3F34E723">
+            <wp:extent cx="5400040" cy="995045"/>
+            <wp:effectExtent l="0" t="0" r="0" b="0"/>
+            <wp:docPr id="8" name="Imagen 8"/>
+            <wp:cNvGraphicFramePr>
+              <a:graphicFrameLocks xmlns:a="http://schemas.openxmlformats.org/drawingml/2006/main" noChangeAspect="1"/>
+            </wp:cNvGraphicFramePr>
+            <a:graphic xmlns:a="http://schemas.openxmlformats.org/drawingml/2006/main">
+              <a:graphicData uri="http://schemas.openxmlformats.org/drawingml/2006/picture">
+                <pic:pic xmlns:pic="http://schemas.openxmlformats.org/drawingml/2006/picture">
+                  <pic:nvPicPr>
+                    <pic:cNvPr id="1" name=""/>
+                    <pic:cNvPicPr/>
+                  </pic:nvPicPr>
+                  <pic:blipFill>
+                    <a:blip r:embed="rId15"/>
+                    <a:stretch>
+                      <a:fillRect/>
+                    </a:stretch>
+                  </pic:blipFill>
+                  <pic:spPr>
+                    <a:xfrm>
+                      <a:off x="0" y="0"/>
                       <a:ext cx="5400040" cy="995045"/>
                     </a:xfrm>
                     <a:prstGeom prst="rect">
@@ -1787,6 +1805,19 @@
           </wp:inline>
         </w:drawing>
       </w:r>
+    </w:p>
+    <w:p>
+      <w:pPr>
+        <w:jc w:val="both"/>
+        <w:rPr>
+          <w:rFonts w:ascii="Times New Roman" w:hAnsi="Times New Roman" w:cs="Times New Roman"/>
+          <w:b/>
+          <w:sz w:val="24"/>
+          <w:szCs w:val="24"/>
+        </w:rPr>
+      </w:pPr>
+      <w:bookmarkStart w:id="0" w:name="_GoBack"/>
+      <w:bookmarkEnd w:id="0"/>
     </w:p>
     <w:sectPr>
       <w:pgSz w:w="11906" w:h="16838"/>

</xml_diff>